<commit_message>
Add updated final report document and research document
</commit_message>
<xml_diff>
--- a/docs/Rustamov Temur C00280204 Research.docx
+++ b/docs/Rustamov Temur C00280204 Research.docx
@@ -1733,26 +1733,11 @@
       <w:r>
         <w:t xml:space="preserve">Universities increasingly face challenges in providing timely academic support due to large cohorts, limited staff availability, and barriers to student help-seeking. Research indicates that student engagement and perceived support are strongly linked to retention and academic success (Tinto, 2014; Krause and Coates, 2008). Peer tutoring is a validated approach that can improve learning outcomes, self-regulated learning </w:t>
       </w:r>
-      <w:proofErr w:type="spellStart"/>
-      <w:r>
-        <w:t>behaviours</w:t>
-      </w:r>
-      <w:proofErr w:type="spellEnd"/>
-      <w:r>
-        <w:t xml:space="preserve">, teamwork, and motivation, benefiting both tutors and tutees (Fernández-Martín et al., 2022; Brousseau et al., 2019). This project proposes a Peer Tutoring Web App that enables university students to request and provide academic support via profiles, posts, messaging, scheduling, and feedback/recognition mechanisms. The research reviewed evidence for peer tutoring effectiveness, examined online tutoring platform patterns, and translated findings into design decisions and measurable success criteria. A MERN-based architecture is selected to support rapid full-stack development, flexible social data modelling, and real-time communication for peer </w:t>
-      </w:r>
-      <w:proofErr w:type="spellStart"/>
-      <w:proofErr w:type="gramStart"/>
-      <w:r>
-        <w:t>interaction.</w:t>
-      </w:r>
-      <w:r>
-        <w:t>development</w:t>
-      </w:r>
-      <w:proofErr w:type="spellEnd"/>
-      <w:proofErr w:type="gramEnd"/>
-      <w:r>
-        <w:t xml:space="preserve"> challenges, testing outcomes, and lessons learned throughout the project lifecycle.</w:t>
+      <w:r>
+        <w:t>behaviors</w:t>
+      </w:r>
+      <w:r>
+        <w:t>, teamwork, and motivation, benefiting both tutors and tutees (Fernández-Martín et al., 2022; Brousseau et al., 2019). This project proposes a Peer Tutoring Web App that enables university students to request and provide academic support via profiles, posts, messaging, scheduling, and feedback/recognition mechanisms. The research reviewed evidence for peer tutoring effectiveness, examined online tutoring platform patterns, and translated findings into design decisions and measurable success criteria. A MERN-based architecture is selected to support rapid full-stack development, flexible social data modelling, and real-time communication for peer interaction</w:t>
       </w:r>
     </w:p>
     <w:p>
@@ -1816,19 +1801,15 @@
       <w:r>
         <w:t xml:space="preserve">Higher education students frequently struggle to obtain prompt, </w:t>
       </w:r>
-      <w:proofErr w:type="spellStart"/>
-      <w:r>
-        <w:t>personalised</w:t>
-      </w:r>
-      <w:proofErr w:type="spellEnd"/>
+      <w:r>
+        <w:t>personalized</w:t>
+      </w:r>
       <w:r>
         <w:t xml:space="preserve"> academic support, particularly in early undergraduate years. While universities offer lectures, tutorials, and consultations, increasing class sizes and scheduling constraints can reduce staff-student interaction and delay assistance (Krause and Coates, 2008). In parallel, help-seeking can be inhibited by fear of judgement, anxiety, or low confidence, which can negatively affect performance and persistence (Tinto, 2014). These issues motivate the development of scalable peer-supported systems that reduce response time and encourage positive help-seeking </w:t>
       </w:r>
-      <w:proofErr w:type="spellStart"/>
-      <w:r>
-        <w:t>behaviour</w:t>
-      </w:r>
-      <w:proofErr w:type="spellEnd"/>
+      <w:r>
+        <w:t>behavior</w:t>
+      </w:r>
       <w:r>
         <w:t>.</w:t>
       </w:r>
@@ -1878,7 +1859,6 @@
           <w:sz w:val="32"/>
           <w:szCs w:val="32"/>
         </w:rPr>
-        <w:lastRenderedPageBreak/>
         <w:t>Academic Need and Educational Rationale</w:t>
       </w:r>
     </w:p>
@@ -1900,10 +1880,7 @@
     </w:p>
     <w:p>
       <w:r>
-        <w:t>The project must demonstrate a clear educational need and show that the proposed solution aligns with known drivers of academic success</w:t>
-      </w:r>
-      <w:r>
-        <w:t>.</w:t>
+        <w:t>The project must demonstrate a clear educational need and show that the proposed solution aligns with known drivers of academic success.</w:t>
       </w:r>
     </w:p>
     <w:p/>
@@ -2097,7 +2074,6 @@
         <w:rPr>
           <w:color w:val="000000" w:themeColor="text1"/>
         </w:rPr>
-        <w:lastRenderedPageBreak/>
         <w:t>Include structured interaction points as request, accept, session, feedback rather than purely informal messaging</w:t>
       </w:r>
       <w:r>
@@ -2130,6 +2106,7 @@
         </w:numPr>
       </w:pPr>
       <w:r>
+        <w:lastRenderedPageBreak/>
         <w:t xml:space="preserve">Build </w:t>
       </w:r>
       <w:r>
@@ -2372,7 +2349,6 @@
         <w:pStyle w:val="NormalWeb"/>
       </w:pPr>
       <w:r>
-        <w:lastRenderedPageBreak/>
         <w:t>Why this was researched</w:t>
       </w:r>
     </w:p>
@@ -2381,6 +2357,7 @@
         <w:pStyle w:val="NormalWeb"/>
       </w:pPr>
       <w:r>
+        <w:lastRenderedPageBreak/>
         <w:t>This was researched to translate evidence into concrete system requirements.</w:t>
       </w:r>
     </w:p>
@@ -2506,7 +2483,42 @@
         <w:pStyle w:val="NormalWeb"/>
       </w:pPr>
       <w:r>
-        <w:t>This area was researched because the chosen stack must support real-time interaction, evolving social data structures, rapid iterative development, and a reliable demonstration-ready deployment. A peer tutoring platform is interaction-heavy and must handle posts, comments, messaging, notifications, and continuous user activity efficiently.</w:t>
+        <w:lastRenderedPageBreak/>
+        <w:drawing>
+          <wp:inline distT="0" distB="0" distL="0" distR="0" wp14:anchorId="26D7D92A" wp14:editId="084E787C">
+            <wp:extent cx="3695700" cy="2463800"/>
+            <wp:effectExtent l="0" t="0" r="0" b="0"/>
+            <wp:docPr id="1219092343" name="Picture 1" descr="A diagram of a program&#10;&#10;AI-generated content may be incorrect."/>
+            <wp:cNvGraphicFramePr>
+              <a:graphicFrameLocks xmlns:a="http://schemas.openxmlformats.org/drawingml/2006/main" noChangeAspect="1"/>
+            </wp:cNvGraphicFramePr>
+            <a:graphic xmlns:a="http://schemas.openxmlformats.org/drawingml/2006/main">
+              <a:graphicData uri="http://schemas.openxmlformats.org/drawingml/2006/picture">
+                <pic:pic xmlns:pic="http://schemas.openxmlformats.org/drawingml/2006/picture">
+                  <pic:nvPicPr>
+                    <pic:cNvPr id="1219092343" name="Picture 1" descr="A diagram of a program&#10;&#10;AI-generated content may be incorrect."/>
+                    <pic:cNvPicPr/>
+                  </pic:nvPicPr>
+                  <pic:blipFill>
+                    <a:blip r:embed="rId11"/>
+                    <a:stretch>
+                      <a:fillRect/>
+                    </a:stretch>
+                  </pic:blipFill>
+                  <pic:spPr>
+                    <a:xfrm>
+                      <a:off x="0" y="0"/>
+                      <a:ext cx="3695700" cy="2463800"/>
+                    </a:xfrm>
+                    <a:prstGeom prst="rect">
+                      <a:avLst/>
+                    </a:prstGeom>
+                  </pic:spPr>
+                </pic:pic>
+              </a:graphicData>
+            </a:graphic>
+          </wp:inline>
+        </w:drawing>
       </w:r>
     </w:p>
     <w:p>
@@ -2514,16 +2526,7 @@
         <w:pStyle w:val="NormalWeb"/>
       </w:pPr>
       <w:r>
-        <w:lastRenderedPageBreak/>
-        <w:t xml:space="preserve">The selected solution is the MERN stack (MongoDB, Express.js, React.js, Node.js) combined with </w:t>
-      </w:r>
-      <w:proofErr w:type="spellStart"/>
-      <w:r>
-        <w:t>WebSockets</w:t>
-      </w:r>
-      <w:proofErr w:type="spellEnd"/>
-      <w:r>
-        <w:t xml:space="preserve"> using Socket.io. This stack supports full-stack development in a single language, simplifies integration across the application, and accelerates iteration.</w:t>
+        <w:t>https://media.geeksforgeeks.org/wp-content/uploads/20231109150525/How-MERN-Stack-Works-copy.webp</w:t>
       </w:r>
     </w:p>
     <w:p>
@@ -2531,13 +2534,7 @@
         <w:pStyle w:val="NormalWeb"/>
       </w:pPr>
       <w:r>
-        <w:t xml:space="preserve">This choice is justified because MongoDB is well suited to document-style data that changes during iterative development, which is common in social platforms as features expand. React supports modular, reusable user interface components and enables rapid UI iteration. Node.js provides an event-driven runtime that works well with Socket.io for real-time messaging and notifications. Using JavaScript across the entire stack reduces context switching and improves development efficiency within </w:t>
-      </w:r>
-      <w:r>
-        <w:t xml:space="preserve">the project </w:t>
-      </w:r>
-      <w:r>
-        <w:t>constraints.</w:t>
+        <w:t>This area was researched because the chosen stack must support real-time interaction, evolving social data structures, rapid iterative development, and a reliable demonstration-ready deployment. A peer tutoring platform is interaction-heavy and must handle posts, comments, messaging, notifications, and continuous user activity efficiently.</w:t>
       </w:r>
     </w:p>
     <w:p>
@@ -2545,7 +2542,15 @@
         <w:pStyle w:val="NormalWeb"/>
       </w:pPr>
       <w:r>
-        <w:t>Existing Work</w:t>
+        <w:t xml:space="preserve">The selected solution is the MERN stack (MongoDB, Express.js, React.js, Node.js) combined with </w:t>
+      </w:r>
+      <w:proofErr w:type="spellStart"/>
+      <w:r>
+        <w:t>WebSockets</w:t>
+      </w:r>
+      <w:proofErr w:type="spellEnd"/>
+      <w:r>
+        <w:t xml:space="preserve"> using Socket.io. This stack supports full-stack development in a single language, simplifies integration across the application, and accelerates iteration.</w:t>
       </w:r>
     </w:p>
     <w:p>
@@ -2553,39 +2558,13 @@
         <w:pStyle w:val="NormalWeb"/>
       </w:pPr>
       <w:r>
-        <w:t xml:space="preserve">Several existing platforms support academic or professional learning, but they are primarily designed either as commercial tutoring marketplaces or as general question-and-answer communities rather than structured university peer-support systems. Profi.ru focuses on connecting clients with paid experts, including education service providers (Profi.ru, 2024). Brainly supports collaborative learning by allowing students to post questions and receive answers from other users, but it is largely oriented toward school-level learners and fast Q&amp;A rather than structured peer tutoring relationships (Brainly, 2024). </w:t>
-      </w:r>
-      <w:proofErr w:type="spellStart"/>
-      <w:r>
-        <w:t>Tutorful</w:t>
-      </w:r>
-      <w:proofErr w:type="spellEnd"/>
-      <w:r>
-        <w:t xml:space="preserve"> enables users to search for, compare, and review private tutors, operating mainly as a paid tutoring marketplace (</w:t>
-      </w:r>
-      <w:proofErr w:type="spellStart"/>
-      <w:r>
-        <w:t>Tutorful</w:t>
-      </w:r>
-      <w:proofErr w:type="spellEnd"/>
-      <w:r>
-        <w:t xml:space="preserve">, 2024). Similarly, </w:t>
-      </w:r>
-      <w:proofErr w:type="spellStart"/>
-      <w:r>
-        <w:t>Preply</w:t>
-      </w:r>
-      <w:proofErr w:type="spellEnd"/>
-      <w:r>
-        <w:t xml:space="preserve"> connects learners with tutors for paid one-to-one tutoring sessions, with a strong emphasis on commercial tutoring and language learning (</w:t>
-      </w:r>
-      <w:proofErr w:type="spellStart"/>
-      <w:r>
-        <w:t>Preply</w:t>
-      </w:r>
-      <w:proofErr w:type="spellEnd"/>
-      <w:r>
-        <w:t>, 2024).</w:t>
+        <w:t xml:space="preserve">This choice is justified because MongoDB is well suited to document-style data that changes during iterative development, which is common in social platforms as features expand. React supports modular, reusable user interface components and enables rapid UI iteration. Node.js provides an event-driven runtime that works well with Socket.io for real-time messaging and notifications. Using JavaScript across the entire stack reduces context switching and improves development efficiency within </w:t>
+      </w:r>
+      <w:r>
+        <w:t xml:space="preserve">the project </w:t>
+      </w:r>
+      <w:r>
+        <w:t>constraints.</w:t>
       </w:r>
     </w:p>
     <w:p>
@@ -2593,7 +2572,7 @@
         <w:pStyle w:val="NormalWeb"/>
       </w:pPr>
       <w:r>
-        <w:t xml:space="preserve">Comparison with Existing Work </w:t>
+        <w:t>Existing Work</w:t>
       </w:r>
     </w:p>
     <w:p>
@@ -2601,6 +2580,305 @@
         <w:pStyle w:val="NormalWeb"/>
       </w:pPr>
       <w:r>
+        <w:lastRenderedPageBreak/>
+        <w:fldChar w:fldCharType="begin"/>
+      </w:r>
+      <w:r>
+        <w:instrText xml:space="preserve"> INCLUDEPICTURE "https://tutorful.co.uk/wp-content/uploads/2024/08/tutorful-homepage.jpg" \* MERGEFORMATINET </w:instrText>
+      </w:r>
+      <w:r>
+        <w:fldChar w:fldCharType="separate"/>
+      </w:r>
+      <w:r>
+        <w:rPr>
+          <w:noProof/>
+        </w:rPr>
+        <w:drawing>
+          <wp:inline distT="0" distB="0" distL="0" distR="0" wp14:anchorId="223520BB" wp14:editId="1E3426B1">
+            <wp:extent cx="5943600" cy="3341370"/>
+            <wp:effectExtent l="0" t="0" r="0" b="0"/>
+            <wp:docPr id="1508681843" name="Picture 2" descr="Tutorful homepage"/>
+            <wp:cNvGraphicFramePr>
+              <a:graphicFrameLocks xmlns:a="http://schemas.openxmlformats.org/drawingml/2006/main" noChangeAspect="1"/>
+            </wp:cNvGraphicFramePr>
+            <a:graphic xmlns:a="http://schemas.openxmlformats.org/drawingml/2006/main">
+              <a:graphicData uri="http://schemas.openxmlformats.org/drawingml/2006/picture">
+                <pic:pic xmlns:pic="http://schemas.openxmlformats.org/drawingml/2006/picture">
+                  <pic:nvPicPr>
+                    <pic:cNvPr id="0" name="Picture 3" descr="Tutorful homepage"/>
+                    <pic:cNvPicPr>
+                      <a:picLocks noChangeAspect="1" noChangeArrowheads="1"/>
+                    </pic:cNvPicPr>
+                  </pic:nvPicPr>
+                  <pic:blipFill>
+                    <a:blip r:embed="rId12">
+                      <a:extLst>
+                        <a:ext uri="{28A0092B-C50C-407E-A947-70E740481C1C}">
+                          <a14:useLocalDpi xmlns:a14="http://schemas.microsoft.com/office/drawing/2010/main" val="0"/>
+                        </a:ext>
+                      </a:extLst>
+                    </a:blip>
+                    <a:srcRect/>
+                    <a:stretch>
+                      <a:fillRect/>
+                    </a:stretch>
+                  </pic:blipFill>
+                  <pic:spPr bwMode="auto">
+                    <a:xfrm>
+                      <a:off x="0" y="0"/>
+                      <a:ext cx="5943600" cy="3341370"/>
+                    </a:xfrm>
+                    <a:prstGeom prst="rect">
+                      <a:avLst/>
+                    </a:prstGeom>
+                    <a:noFill/>
+                    <a:ln>
+                      <a:noFill/>
+                    </a:ln>
+                  </pic:spPr>
+                </pic:pic>
+              </a:graphicData>
+            </a:graphic>
+          </wp:inline>
+        </w:drawing>
+      </w:r>
+      <w:r>
+        <w:fldChar w:fldCharType="end"/>
+      </w:r>
+    </w:p>
+    <w:p>
+      <w:pPr>
+        <w:pStyle w:val="NormalWeb"/>
+      </w:pPr>
+      <w:hyperlink r:id="rId13" w:history="1">
+        <w:r>
+          <w:rPr>
+            <w:rStyle w:val="Hyperlink"/>
+          </w:rPr>
+          <w:t>https://tutorful.co.uk/wp-content/uploads/2024/08/tutorful-homepage.jpg.webp</w:t>
+        </w:r>
+      </w:hyperlink>
+    </w:p>
+    <w:p>
+      <w:pPr>
+        <w:pStyle w:val="NormalWeb"/>
+      </w:pPr>
+      <w:r>
+        <w:fldChar w:fldCharType="begin"/>
+      </w:r>
+      <w:r>
+        <w:instrText xml:space="preserve"> INCLUDEPICTURE "https://preply.com/wp-content/uploads/2023/10/three-english-tutors-with-name-and-price-tags-looking-at-camera.jpg" \* MERGEFORMATINET </w:instrText>
+      </w:r>
+      <w:r>
+        <w:fldChar w:fldCharType="separate"/>
+      </w:r>
+      <w:r>
+        <w:rPr>
+          <w:noProof/>
+        </w:rPr>
+        <w:drawing>
+          <wp:inline distT="0" distB="0" distL="0" distR="0" wp14:anchorId="490D9E83" wp14:editId="66B80198">
+            <wp:extent cx="5943600" cy="3401060"/>
+            <wp:effectExtent l="0" t="0" r="0" b="2540"/>
+            <wp:docPr id="429536351" name="Picture 3" descr="A group of people with different colors&#10;&#10;AI-generated content may be incorrect."/>
+            <wp:cNvGraphicFramePr>
+              <a:graphicFrameLocks xmlns:a="http://schemas.openxmlformats.org/drawingml/2006/main" noChangeAspect="1"/>
+            </wp:cNvGraphicFramePr>
+            <a:graphic xmlns:a="http://schemas.openxmlformats.org/drawingml/2006/main">
+              <a:graphicData uri="http://schemas.openxmlformats.org/drawingml/2006/picture">
+                <pic:pic xmlns:pic="http://schemas.openxmlformats.org/drawingml/2006/picture">
+                  <pic:nvPicPr>
+                    <pic:cNvPr id="429536351" name="Picture 3" descr="A group of people with different colors&#10;&#10;AI-generated content may be incorrect."/>
+                    <pic:cNvPicPr>
+                      <a:picLocks noChangeAspect="1" noChangeArrowheads="1"/>
+                    </pic:cNvPicPr>
+                  </pic:nvPicPr>
+                  <pic:blipFill>
+                    <a:blip r:embed="rId14">
+                      <a:extLst>
+                        <a:ext uri="{28A0092B-C50C-407E-A947-70E740481C1C}">
+                          <a14:useLocalDpi xmlns:a14="http://schemas.microsoft.com/office/drawing/2010/main" val="0"/>
+                        </a:ext>
+                      </a:extLst>
+                    </a:blip>
+                    <a:srcRect/>
+                    <a:stretch>
+                      <a:fillRect/>
+                    </a:stretch>
+                  </pic:blipFill>
+                  <pic:spPr bwMode="auto">
+                    <a:xfrm>
+                      <a:off x="0" y="0"/>
+                      <a:ext cx="5943600" cy="3401060"/>
+                    </a:xfrm>
+                    <a:prstGeom prst="rect">
+                      <a:avLst/>
+                    </a:prstGeom>
+                    <a:noFill/>
+                    <a:ln>
+                      <a:noFill/>
+                    </a:ln>
+                  </pic:spPr>
+                </pic:pic>
+              </a:graphicData>
+            </a:graphic>
+          </wp:inline>
+        </w:drawing>
+      </w:r>
+      <w:r>
+        <w:fldChar w:fldCharType="end"/>
+      </w:r>
+    </w:p>
+    <w:p>
+      <w:pPr>
+        <w:pStyle w:val="NormalWeb"/>
+      </w:pPr>
+      <w:hyperlink r:id="rId15" w:history="1">
+        <w:r>
+          <w:rPr>
+            <w:rStyle w:val="Hyperlink"/>
+          </w:rPr>
+          <w:t>https://preply.com/wp-content/uploads/2023/10/three-english-tutors-with-name-and-price-tags-looking-at-camera.jpg</w:t>
+        </w:r>
+      </w:hyperlink>
+    </w:p>
+    <w:p>
+      <w:pPr>
+        <w:pStyle w:val="NormalWeb"/>
+      </w:pPr>
+    </w:p>
+    <w:p>
+      <w:pPr>
+        <w:pStyle w:val="NormalWeb"/>
+      </w:pPr>
+      <w:r>
+        <w:lastRenderedPageBreak/>
+        <w:t xml:space="preserve">Several existing platforms support academic or professional learning, but they are primarily designed either as commercial tutoring marketplaces or as general question-and-answer communities rather than structured university peer-support systems. Profi.ru focuses on connecting clients with paid experts, including education service providers (Profi.ru, 2024). Brainly supports collaborative learning by allowing students to post questions and receive answers from other users, but it is largely oriented toward school-level learners and fast Q&amp;A rather than structured peer tutoring relationships (Brainly, 2024). </w:t>
+      </w:r>
+      <w:proofErr w:type="spellStart"/>
+      <w:r>
+        <w:t>Tutorful</w:t>
+      </w:r>
+      <w:proofErr w:type="spellEnd"/>
+      <w:r>
+        <w:t xml:space="preserve"> enables users to search for, compare, and review private tutors, operating mainly as a paid tutoring marketplace (</w:t>
+      </w:r>
+      <w:proofErr w:type="spellStart"/>
+      <w:r>
+        <w:t>Tutorful</w:t>
+      </w:r>
+      <w:proofErr w:type="spellEnd"/>
+      <w:r>
+        <w:t xml:space="preserve">, 2024). Similarly, </w:t>
+      </w:r>
+      <w:proofErr w:type="spellStart"/>
+      <w:r>
+        <w:t>Preply</w:t>
+      </w:r>
+      <w:proofErr w:type="spellEnd"/>
+      <w:r>
+        <w:t xml:space="preserve"> connects learners with tutors for paid one-to-one tutoring sessions, with a strong emphasis on commercial tutoring and language learning (</w:t>
+      </w:r>
+      <w:proofErr w:type="spellStart"/>
+      <w:r>
+        <w:t>Preply</w:t>
+      </w:r>
+      <w:proofErr w:type="spellEnd"/>
+      <w:r>
+        <w:t>, 2024).</w:t>
+      </w:r>
+    </w:p>
+    <w:p>
+      <w:pPr>
+        <w:pStyle w:val="NormalWeb"/>
+      </w:pPr>
+      <w:r>
+        <w:t xml:space="preserve">Comparison with Existing Work </w:t>
+      </w:r>
+    </w:p>
+    <w:p>
+      <w:pPr>
+        <w:pStyle w:val="NormalWeb"/>
+      </w:pPr>
+      <w:r>
+        <w:fldChar w:fldCharType="begin"/>
+      </w:r>
+      <w:r>
+        <w:instrText xml:space="preserve"> INCLUDEPICTURE "https://community.brainly.com/us/wp-content/uploads/sites/9/2021/05/Brainly-Universe-950x635-c-default.jpeg" \* MERGEFORMATINET </w:instrText>
+      </w:r>
+      <w:r>
+        <w:fldChar w:fldCharType="separate"/>
+      </w:r>
+      <w:r>
+        <w:rPr>
+          <w:noProof/>
+        </w:rPr>
+        <w:drawing>
+          <wp:inline distT="0" distB="0" distL="0" distR="0" wp14:anchorId="07AE5A09" wp14:editId="0823B3F0">
+            <wp:extent cx="5943600" cy="3971925"/>
+            <wp:effectExtent l="0" t="0" r="0" b="3175"/>
+            <wp:docPr id="558376341" name="Picture 4" descr="Brainly Old Logo New Logo - Brainly.com"/>
+            <wp:cNvGraphicFramePr>
+              <a:graphicFrameLocks xmlns:a="http://schemas.openxmlformats.org/drawingml/2006/main" noChangeAspect="1"/>
+            </wp:cNvGraphicFramePr>
+            <a:graphic xmlns:a="http://schemas.openxmlformats.org/drawingml/2006/main">
+              <a:graphicData uri="http://schemas.openxmlformats.org/drawingml/2006/picture">
+                <pic:pic xmlns:pic="http://schemas.openxmlformats.org/drawingml/2006/picture">
+                  <pic:nvPicPr>
+                    <pic:cNvPr id="0" name="Picture 7" descr="Brainly Old Logo New Logo - Brainly.com"/>
+                    <pic:cNvPicPr>
+                      <a:picLocks noChangeAspect="1" noChangeArrowheads="1"/>
+                    </pic:cNvPicPr>
+                  </pic:nvPicPr>
+                  <pic:blipFill>
+                    <a:blip r:embed="rId16">
+                      <a:extLst>
+                        <a:ext uri="{28A0092B-C50C-407E-A947-70E740481C1C}">
+                          <a14:useLocalDpi xmlns:a14="http://schemas.microsoft.com/office/drawing/2010/main" val="0"/>
+                        </a:ext>
+                      </a:extLst>
+                    </a:blip>
+                    <a:srcRect/>
+                    <a:stretch>
+                      <a:fillRect/>
+                    </a:stretch>
+                  </pic:blipFill>
+                  <pic:spPr bwMode="auto">
+                    <a:xfrm>
+                      <a:off x="0" y="0"/>
+                      <a:ext cx="5943600" cy="3971925"/>
+                    </a:xfrm>
+                    <a:prstGeom prst="rect">
+                      <a:avLst/>
+                    </a:prstGeom>
+                    <a:noFill/>
+                    <a:ln>
+                      <a:noFill/>
+                    </a:ln>
+                  </pic:spPr>
+                </pic:pic>
+              </a:graphicData>
+            </a:graphic>
+          </wp:inline>
+        </w:drawing>
+      </w:r>
+      <w:r>
+        <w:fldChar w:fldCharType="end"/>
+      </w:r>
+    </w:p>
+    <w:p>
+      <w:pPr>
+        <w:pStyle w:val="NormalWeb"/>
+      </w:pPr>
+      <w:r>
+        <w:t>https://community.brainly.com/us/wp-content/uploads/sites/9/2021/05/Brainly-Universe-950x635-c-default.jpeg</w:t>
+      </w:r>
+    </w:p>
+    <w:p>
+      <w:pPr>
+        <w:pStyle w:val="NormalWeb"/>
+      </w:pPr>
+      <w:r>
         <w:t xml:space="preserve">The proposed Peer Tutoring Web App differs from these platforms by focusing on free, community-driven peer academic support within a university context, where students both request and </w:t>
       </w:r>
       <w:proofErr w:type="gramStart"/>
@@ -2625,7 +2903,11 @@
       </w:r>
       <w:proofErr w:type="spellEnd"/>
       <w:r>
-        <w:t xml:space="preserve"> lacks a volunteering-based model and is oriented toward purchasing private tutoring rather than enabling mutual peer support within a university community. </w:t>
+        <w:t xml:space="preserve"> lacks a volunteering-based model and is oriented toward purchasing private tutoring rather than </w:t>
+      </w:r>
+      <w:r>
+        <w:lastRenderedPageBreak/>
+        <w:t xml:space="preserve">enabling mutual peer support within a university community. </w:t>
       </w:r>
       <w:proofErr w:type="spellStart"/>
       <w:r>
@@ -2868,7 +3150,6 @@
                 <w:sz w:val="24"/>
                 <w:szCs w:val="24"/>
               </w:rPr>
-              <w:lastRenderedPageBreak/>
               <w:t>Tutorful</w:t>
             </w:r>
             <w:proofErr w:type="spellEnd"/>
@@ -2970,31 +3251,6 @@
     </w:tbl>
     <w:p>
       <w:pPr>
-        <w:pStyle w:val="NormalWeb"/>
-      </w:pPr>
-    </w:p>
-    <w:p>
-      <w:pPr>
-        <w:pStyle w:val="NormalWeb"/>
-      </w:pPr>
-    </w:p>
-    <w:p>
-      <w:pPr>
-        <w:pStyle w:val="ListParagraph"/>
-        <w:rPr>
-          <w:color w:val="000000" w:themeColor="text1"/>
-        </w:rPr>
-      </w:pPr>
-    </w:p>
-    <w:p>
-      <w:pPr>
-        <w:rPr>
-          <w:color w:val="000000" w:themeColor="text1"/>
-        </w:rPr>
-      </w:pPr>
-    </w:p>
-    <w:p>
-      <w:pPr>
         <w:jc w:val="both"/>
       </w:pPr>
     </w:p>
@@ -3175,6 +3431,7 @@
         <w:pStyle w:val="NormalWeb"/>
       </w:pPr>
       <w:r>
+        <w:lastRenderedPageBreak/>
         <w:t xml:space="preserve">Greenwald, A.G., Hedges, L.V. and Laine, R.D. (1996). The effect of school resources on student achievement. </w:t>
       </w:r>
       <w:r>
@@ -3193,7 +3450,6 @@
         <w:pStyle w:val="NormalWeb"/>
       </w:pPr>
       <w:r>
-        <w:lastRenderedPageBreak/>
         <w:t xml:space="preserve">Greenwood, C.R., Carta, J.J. and Hall, R.V. (1988). The use of peer tutoring strategies in classroom management and academic instruction. </w:t>
       </w:r>
       <w:r>
@@ -3224,7 +3480,7 @@
       <w:r>
         <w:t xml:space="preserve">, 44(1), pp. 183–200. </w:t>
       </w:r>
-      <w:hyperlink r:id="rId11" w:tgtFrame="_new" w:history="1">
+      <w:hyperlink r:id="rId17" w:tgtFrame="_new" w:history="1">
         <w:r>
           <w:rPr>
             <w:rStyle w:val="Hyperlink"/>
@@ -3392,7 +3648,7 @@
       <w:r>
         <w:t xml:space="preserve">. [online] Available: </w:t>
       </w:r>
-      <w:hyperlink r:id="rId12" w:tgtFrame="_new" w:history="1">
+      <w:hyperlink r:id="rId18" w:tgtFrame="_new" w:history="1">
         <w:r>
           <w:rPr>
             <w:rStyle w:val="Hyperlink"/>
@@ -3463,6 +3719,7 @@
         <w:pStyle w:val="NormalWeb"/>
       </w:pPr>
       <w:r>
+        <w:lastRenderedPageBreak/>
         <w:t xml:space="preserve">Topping, K.J. (2001). Peer assisted learning: A practical guide for teachers. </w:t>
       </w:r>
       <w:r>
@@ -3481,7 +3738,6 @@
         <w:pStyle w:val="NormalWeb"/>
       </w:pPr>
       <w:r>
-        <w:lastRenderedPageBreak/>
         <w:t xml:space="preserve">Topping, K.J. (2002). Peer and parent-assisted learning in reading. </w:t>
       </w:r>
       <w:r>
@@ -3849,8 +4105,8 @@
     </w:sdt>
     <w:p/>
     <w:sectPr>
-      <w:footerReference w:type="even" r:id="rId13"/>
-      <w:footerReference w:type="default" r:id="rId14"/>
+      <w:footerReference w:type="even" r:id="rId19"/>
+      <w:footerReference w:type="default" r:id="rId20"/>
       <w:pgSz w:w="12240" w:h="15840"/>
       <w:pgMar w:top="1440" w:right="1440" w:bottom="1440" w:left="1440" w:header="0" w:footer="720" w:gutter="0"/>
       <w:cols w:space="720"/>
@@ -12632,6 +12888,7 @@
   <w:style w:type="character" w:default="1" w:styleId="DefaultParagraphFont">
     <w:name w:val="Default Paragraph Font"/>
     <w:uiPriority w:val="1"/>
+    <w:semiHidden/>
     <w:unhideWhenUsed/>
   </w:style>
   <w:style w:type="table" w:default="1" w:styleId="TableNormal">

</xml_diff>